<commit_message>
long time no see
</commit_message>
<xml_diff>
--- a/resources/Sujet_projet_INSA.docx
+++ b/resources/Sujet_projet_INSA.docx
@@ -217,56 +217,59 @@
         <w:t xml:space="preserve">, dans les environnements </w:t>
       </w:r>
       <w:proofErr w:type="spellStart"/>
+      <w:r>
+        <w:t>comprennant</w:t>
+      </w:r>
+      <w:proofErr w:type="spellEnd"/>
+      <w:r>
+        <w:t xml:space="preserve"> </w:t>
+      </w:r>
+      <w:r>
+        <w:t>peu de ressources</w:t>
+      </w:r>
+      <w:r>
+        <w:t>, comme un sol pauvre en nutriment</w:t>
+      </w:r>
+      <w:r>
+        <w:t>s</w:t>
+      </w:r>
+      <w:r>
+        <w:t xml:space="preserve"> di</w:t>
+      </w:r>
+      <w:r>
+        <w:t>s</w:t>
+      </w:r>
+      <w:r>
+        <w:t>ponible</w:t>
+      </w:r>
+      <w:r>
+        <w:t>s</w:t>
+      </w:r>
+      <w:r>
+        <w:t xml:space="preserve"> ou peu irrigué</w:t>
+      </w:r>
+      <w:r>
+        <w:t xml:space="preserve">, la complémentarité des espèces pour l’exploitation </w:t>
+      </w:r>
+      <w:r>
+        <w:t xml:space="preserve">durable </w:t>
+      </w:r>
+      <w:r>
+        <w:t xml:space="preserve">des ressources </w:t>
+      </w:r>
       <w:proofErr w:type="gramStart"/>
       <w:r>
-        <w:t>comprennant</w:t>
-      </w:r>
-      <w:proofErr w:type="spellEnd"/>
+        <w:t>environn</w:t>
+      </w:r>
+      <w:r>
+        <w:t>e</w:t>
+      </w:r>
+      <w:r>
+        <w:t>mentales</w:t>
+      </w:r>
       <w:proofErr w:type="gramEnd"/>
       <w:r>
         <w:t xml:space="preserve"> </w:t>
-      </w:r>
-      <w:r>
-        <w:t>peu de ressources</w:t>
-      </w:r>
-      <w:r>
-        <w:t>, comme un sol pauvre en nutriment</w:t>
-      </w:r>
-      <w:r>
-        <w:t>s</w:t>
-      </w:r>
-      <w:r>
-        <w:t xml:space="preserve"> di</w:t>
-      </w:r>
-      <w:r>
-        <w:t>s</w:t>
-      </w:r>
-      <w:r>
-        <w:t>ponible</w:t>
-      </w:r>
-      <w:r>
-        <w:t>s</w:t>
-      </w:r>
-      <w:r>
-        <w:t xml:space="preserve"> ou peu irrigué</w:t>
-      </w:r>
-      <w:r>
-        <w:t xml:space="preserve">, la complémentarité des espèces pour l’exploitation </w:t>
-      </w:r>
-      <w:r>
-        <w:t xml:space="preserve">durable </w:t>
-      </w:r>
-      <w:r>
-        <w:t xml:space="preserve">des ressources </w:t>
-      </w:r>
-      <w:r>
-        <w:t>environn</w:t>
-      </w:r>
-      <w:r>
-        <w:t>e</w:t>
-      </w:r>
-      <w:r>
-        <w:t xml:space="preserve">mentales </w:t>
       </w:r>
       <w:r>
         <w:t xml:space="preserve">peut augmenter les rendements </w:t>
@@ -428,8 +431,10 @@
       <w:r>
         <w:t xml:space="preserve">associées </w:t>
       </w:r>
-      <w:r>
-        <w:t xml:space="preserve">et les mélanges de couverts avec des modèles de culture qui considèrent une distribution homogène du couvert végétal et des systèmes racinaires sans hétérogénéité spatiale et temporelle ? </w:t>
+      <w:bookmarkStart w:id="3" w:name="_GoBack"/>
+      <w:bookmarkEnd w:id="3"/>
+      <w:r>
+        <w:t xml:space="preserve">avec des modèles de culture qui considèrent une distribution homogène du couvert végétal et des systèmes racinaires sans hétérogénéité spatiale et temporelle ? </w:t>
       </w:r>
       <w:r>
         <w:t>b</w:t>
@@ -781,8 +786,6 @@
       <w:r>
         <w:t>La description du pipeline en quelques slides</w:t>
       </w:r>
-      <w:bookmarkStart w:id="3" w:name="_GoBack"/>
-      <w:bookmarkEnd w:id="3"/>
     </w:p>
     <w:p>
       <w:pPr>
@@ -800,6 +803,21 @@
       <w:r>
         <w:t xml:space="preserve"> pour les analyses et la visualisation</w:t>
       </w:r>
+    </w:p>
+    <w:p>
+      <w:pPr>
+        <w:spacing w:line="240" w:lineRule="auto"/>
+        <w:jc w:val="both"/>
+      </w:pPr>
+    </w:p>
+    <w:p>
+      <w:pPr>
+        <w:spacing w:line="240" w:lineRule="auto"/>
+        <w:jc w:val="both"/>
+        <w:rPr>
+          <w:vertAlign w:val="superscript"/>
+        </w:rPr>
+      </w:pPr>
     </w:p>
     <w:sectPr>
       <w:pgSz w:w="11906" w:h="16838"/>
@@ -2082,6 +2100,21 @@
 </file>
 
 <file path=customXml/item1.xml><?xml version="1.0" encoding="utf-8"?>
+<p:properties xmlns:p="http://schemas.microsoft.com/office/2006/metadata/properties" xmlns:xsi="http://www.w3.org/2001/XMLSchema-instance" xmlns:pc="http://schemas.microsoft.com/office/infopath/2007/PartnerControls">
+  <documentManagement/>
+</p:properties>
+</file>
+
+<file path=customXml/item2.xml><?xml version="1.0" encoding="utf-8"?>
+<?mso-contentType ?>
+<FormTemplates xmlns="http://schemas.microsoft.com/sharepoint/v3/contenttype/forms">
+  <Display>DocumentLibraryForm</Display>
+  <Edit>DocumentLibraryForm</Edit>
+  <New>DocumentLibraryForm</New>
+</FormTemplates>
+</file>
+
+<file path=customXml/item3.xml><?xml version="1.0" encoding="utf-8"?>
 <ct:contentTypeSchema xmlns:ct="http://schemas.microsoft.com/office/2006/metadata/contentType" xmlns:ma="http://schemas.microsoft.com/office/2006/metadata/properties/metaAttributes" ct:_="" ma:_="" ma:contentTypeName="Document" ma:contentTypeID="0x010100F6AAEAEC55338B4CBD1310BC20ECA43B" ma:contentTypeVersion="6" ma:contentTypeDescription="Crée un document." ma:contentTypeScope="" ma:versionID="f3bee9aad377d983e5ace40107548819">
   <xsd:schema xmlns:xsd="http://www.w3.org/2001/XMLSchema" xmlns:xs="http://www.w3.org/2001/XMLSchema" xmlns:p="http://schemas.microsoft.com/office/2006/metadata/properties" xmlns:ns2="5e11a331-0175-485c-b5bc-7baf3794bcc4" xmlns:ns3="6123b362-d884-4010-ad19-191a22b79bf5" targetNamespace="http://schemas.microsoft.com/office/2006/metadata/properties" ma:root="true" ma:fieldsID="da4ddf064b527fafbeea9bca5b83bae1" ns2:_="" ns3:_="">
     <xsd:import namespace="5e11a331-0175-485c-b5bc-7baf3794bcc4"/>
@@ -2258,22 +2291,24 @@
 </ct:contentTypeSchema>
 </file>
 
-<file path=customXml/item2.xml><?xml version="1.0" encoding="utf-8"?>
-<?mso-contentType ?>
-<FormTemplates xmlns="http://schemas.microsoft.com/sharepoint/v3/contenttype/forms">
-  <Display>DocumentLibraryForm</Display>
-  <Edit>DocumentLibraryForm</Edit>
-  <New>DocumentLibraryForm</New>
-</FormTemplates>
+<file path=customXml/itemProps1.xml><?xml version="1.0" encoding="utf-8"?>
+<ds:datastoreItem xmlns:ds="http://schemas.openxmlformats.org/officeDocument/2006/customXml" ds:itemID="{49D09D4B-7C05-4B04-B871-E0CFD582777E}">
+  <ds:schemaRefs>
+    <ds:schemaRef ds:uri="http://schemas.microsoft.com/office/2006/metadata/properties"/>
+    <ds:schemaRef ds:uri="http://schemas.microsoft.com/office/infopath/2007/PartnerControls"/>
+  </ds:schemaRefs>
+</ds:datastoreItem>
 </file>
 
-<file path=customXml/item3.xml><?xml version="1.0" encoding="utf-8"?>
-<p:properties xmlns:p="http://schemas.microsoft.com/office/2006/metadata/properties" xmlns:xsi="http://www.w3.org/2001/XMLSchema-instance" xmlns:pc="http://schemas.microsoft.com/office/infopath/2007/PartnerControls">
-  <documentManagement/>
-</p:properties>
+<file path=customXml/itemProps2.xml><?xml version="1.0" encoding="utf-8"?>
+<ds:datastoreItem xmlns:ds="http://schemas.openxmlformats.org/officeDocument/2006/customXml" ds:itemID="{3502CC66-4ACF-4451-911F-1A5D8752709C}">
+  <ds:schemaRefs>
+    <ds:schemaRef ds:uri="http://schemas.microsoft.com/sharepoint/v3/contenttype/forms"/>
+  </ds:schemaRefs>
+</ds:datastoreItem>
 </file>
 
-<file path=customXml/itemProps1.xml><?xml version="1.0" encoding="utf-8"?>
+<file path=customXml/itemProps3.xml><?xml version="1.0" encoding="utf-8"?>
 <ds:datastoreItem xmlns:ds="http://schemas.openxmlformats.org/officeDocument/2006/customXml" ds:itemID="{9A0146F6-51FB-469E-B3A2-88256CADABB8}">
   <ds:schemaRefs>
     <ds:schemaRef ds:uri="http://schemas.microsoft.com/office/2006/metadata/contentType"/>
@@ -2290,21 +2325,4 @@
     <ds:schemaRef ds:uri="http://schemas.microsoft.com/internal/obd"/>
   </ds:schemaRefs>
 </ds:datastoreItem>
-</file>
-
-<file path=customXml/itemProps2.xml><?xml version="1.0" encoding="utf-8"?>
-<ds:datastoreItem xmlns:ds="http://schemas.openxmlformats.org/officeDocument/2006/customXml" ds:itemID="{3502CC66-4ACF-4451-911F-1A5D8752709C}">
-  <ds:schemaRefs>
-    <ds:schemaRef ds:uri="http://schemas.microsoft.com/sharepoint/v3/contenttype/forms"/>
-  </ds:schemaRefs>
-</ds:datastoreItem>
-</file>
-
-<file path=customXml/itemProps3.xml><?xml version="1.0" encoding="utf-8"?>
-<ds:datastoreItem xmlns:ds="http://schemas.openxmlformats.org/officeDocument/2006/customXml" ds:itemID="{49D09D4B-7C05-4B04-B871-E0CFD582777E}">
-  <ds:schemaRefs>
-    <ds:schemaRef ds:uri="http://schemas.microsoft.com/office/2006/metadata/properties"/>
-    <ds:schemaRef ds:uri="http://schemas.microsoft.com/office/infopath/2007/PartnerControls"/>
-  </ds:schemaRefs>
-</ds:datastoreItem>
 </file>
</xml_diff>